<commit_message>
Normalize VIDA case compliance
</commit_message>
<xml_diff>
--- a/18_DOCX/VIDA_CASES_0001_0008.docx
+++ b/18_DOCX/VIDA_CASES_0001_0008.docx
@@ -7,14 +7,61 @@
         <w:pStyle w:val="Heading1"/>
       </w:pPr>
       <w:r>
-        <w:t>VIDA_CASES_0001_0008 - Primeiro ciclo de estudos de caso VIDA</w:t>
-      </w:r>
-    </w:p>
-    <w:p>
-      <w:r>
-        <w:t>————————————————————————</w:t>
-      </w:r>
-    </w:p>
+        <w:t>VIDA_CASES_0001_0008 - Estudos de caso VIDA</w:t>
+      </w:r>
+    </w:p>
+    <w:p/>
+    <w:p>
+      <w:pPr>
+        <w:pStyle w:val="Heading2"/>
+      </w:pPr>
+      <w:r>
+        <w:t>Controle</w:t>
+      </w:r>
+    </w:p>
+    <w:p/>
+    <w:p>
+      <w:pPr>
+        <w:pStyle w:val="ListBullet"/>
+      </w:pPr>
+      <w:r>
+        <w:t>Versão: 0.2</w:t>
+      </w:r>
+    </w:p>
+    <w:p>
+      <w:pPr>
+        <w:pStyle w:val="ListBullet"/>
+      </w:pPr>
+      <w:r>
+        <w:t>Data: 2026-06-26</w:t>
+      </w:r>
+    </w:p>
+    <w:p>
+      <w:pPr>
+        <w:pStyle w:val="ListBullet"/>
+      </w:pPr>
+      <w:r>
+        <w:t>Autor: JP-BR Insurance Knowledge Base</w:t>
+      </w:r>
+    </w:p>
+    <w:p>
+      <w:pPr>
+        <w:pStyle w:val="ListBullet"/>
+      </w:pPr>
+      <w:r>
+        <w:t>Histórico: Consolidação atualizada com limite comercial/compliance.</w:t>
+      </w:r>
+    </w:p>
+    <w:p/>
+    <w:p>
+      <w:pPr>
+        <w:pStyle w:val="Heading2"/>
+      </w:pPr>
+      <w:r>
+        <w:t>Conteúdo consolidado</w:t>
+      </w:r>
+    </w:p>
+    <w:p/>
     <w:p>
       <w:pPr>
         <w:pStyle w:val="Heading1"/>
@@ -23,6 +70,7 @@
         <w:t>CASE-VIDA-0001 - Cliente quer proteger família em caso de falecimento</w:t>
       </w:r>
     </w:p>
+    <w:p/>
     <w:p>
       <w:pPr>
         <w:pStyle w:val="Heading2"/>
@@ -31,12 +79,13 @@
         <w:t>Controle</w:t>
       </w:r>
     </w:p>
+    <w:p/>
     <w:p>
       <w:pPr>
         <w:pStyle w:val="ListBullet"/>
       </w:pPr>
       <w:r>
-        <w:t>Versão: 0.1</w:t>
+        <w:t>Versão: 0.2</w:t>
       </w:r>
     </w:p>
     <w:p>
@@ -60,9 +109,10 @@
         <w:pStyle w:val="ListBullet"/>
       </w:pPr>
       <w:r>
-        <w:t>Histórico: Criação inicial.</w:t>
-      </w:r>
-    </w:p>
+        <w:t>Histórico: Criação inicial; inclusão de limite comercial/compliance.</w:t>
+      </w:r>
+    </w:p>
+    <w:p/>
     <w:p>
       <w:pPr>
         <w:pStyle w:val="Heading2"/>
@@ -71,11 +121,13 @@
         <w:t>Código</w:t>
       </w:r>
     </w:p>
+    <w:p/>
     <w:p>
       <w:r>
         <w:t>CASE-VIDA-0001</w:t>
       </w:r>
     </w:p>
+    <w:p/>
     <w:p>
       <w:pPr>
         <w:pStyle w:val="Heading2"/>
@@ -84,11 +136,13 @@
         <w:t>Produto ou categoria</w:t>
       </w:r>
     </w:p>
+    <w:p/>
     <w:p>
       <w:r>
         <w:t>VIDA</w:t>
       </w:r>
     </w:p>
+    <w:p/>
     <w:p>
       <w:pPr>
         <w:pStyle w:val="Heading2"/>
@@ -97,11 +151,13 @@
         <w:t>Situação</w:t>
       </w:r>
     </w:p>
+    <w:p/>
     <w:p>
       <w:r>
         <w:t>Cliente quer proteger família em caso de falecimento.</w:t>
       </w:r>
     </w:p>
+    <w:p/>
     <w:p>
       <w:pPr>
         <w:pStyle w:val="Heading2"/>
@@ -110,11 +166,13 @@
         <w:t>Problema</w:t>
       </w:r>
     </w:p>
+    <w:p/>
     <w:p>
       <w:r>
         <w:t>Cliente pode escolher cobertura inadequada por não entender finalidade, papéis contratuais, períodos ou regras iniciais do seguro de vida.</w:t>
       </w:r>
     </w:p>
+    <w:p/>
     <w:p>
       <w:pPr>
         <w:pStyle w:val="Heading2"/>
@@ -123,11 +181,13 @@
         <w:t>Análise</w:t>
       </w:r>
     </w:p>
+    <w:p/>
     <w:p>
       <w:r>
         <w:t>Seguro de vida deve ser explicado a partir da finalidade de proteção, pessoas envolvidas, valor de cobertura, prêmio, período e condições de aceitação.</w:t>
       </w:r>
     </w:p>
+    <w:p/>
     <w:p>
       <w:pPr>
         <w:pStyle w:val="Heading2"/>
@@ -136,11 +196,13 @@
         <w:t>Orientação ao corretor</w:t>
       </w:r>
     </w:p>
+    <w:p/>
     <w:p>
       <w:r>
         <w:t>Confirmar objetivo do cliente, estrutura familiar, orçamento, necessidade de proteção e entendimento sobre declaração de saúde e início da cobertura.</w:t>
       </w:r>
     </w:p>
+    <w:p/>
     <w:p>
       <w:pPr>
         <w:pStyle w:val="Heading2"/>
@@ -149,11 +211,13 @@
         <w:t>Como explicar ao cliente brasileiro</w:t>
       </w:r>
     </w:p>
+    <w:p/>
     <w:p>
       <w:r>
         <w:t>Antes de escolher o seguro, precisamos entender quem será protegido, quem receberá o valor e quando a cobertura começa.</w:t>
       </w:r>
     </w:p>
+    <w:p/>
     <w:p>
       <w:pPr>
         <w:pStyle w:val="Heading2"/>
@@ -162,19 +226,37 @@
         <w:t>Resultado esperado</w:t>
       </w:r>
     </w:p>
+    <w:p/>
     <w:p>
       <w:r>
         <w:t>Cliente compreende os fundamentos e consegue comparar opções sem confundir tipos de cobertura.</w:t>
       </w:r>
     </w:p>
+    <w:p/>
     <w:p>
       <w:pPr>
         <w:pStyle w:val="Heading2"/>
       </w:pPr>
       <w:r>
+        <w:t>Limite comercial/compliance</w:t>
+      </w:r>
+    </w:p>
+    <w:p/>
+    <w:p>
+      <w:r>
+        <w:t>O corretor deve usar este caso como orientação de atendimento, sem prometer aceitação, cobertura, valor de indenização, prazo, benefício fiscal, manutenção de contrato ou resultado de análise. A decisão final depende da apólice, declaração de saúde, documentos, situação familiar, regras fiscais quando aplicáveis e avaliação da seguradora ou órgão competente.</w:t>
+      </w:r>
+    </w:p>
+    <w:p/>
+    <w:p>
+      <w:pPr>
+        <w:pStyle w:val="Heading2"/>
+      </w:pPr>
+      <w:r>
         <w:t>Termos relacionados</w:t>
       </w:r>
     </w:p>
+    <w:p/>
     <w:p>
       <w:pPr>
         <w:pStyle w:val="ListBullet"/>
@@ -191,6 +273,7 @@
         <w:t>VIDA-0002 - 死亡保険 - Seguro por morte</w:t>
       </w:r>
     </w:p>
+    <w:p/>
     <w:p>
       <w:pPr>
         <w:pStyle w:val="Heading2"/>
@@ -199,6 +282,7 @@
         <w:t>FAQs relacionadas</w:t>
       </w:r>
     </w:p>
+    <w:p/>
     <w:p>
       <w:pPr>
         <w:pStyle w:val="ListBullet"/>
@@ -215,6 +299,7 @@
         <w:t>FAQ-VIDA-0002</w:t>
       </w:r>
     </w:p>
+    <w:p/>
     <w:p>
       <w:pPr>
         <w:pStyle w:val="Heading2"/>
@@ -223,6 +308,7 @@
         <w:t>Diálogos relacionados</w:t>
       </w:r>
     </w:p>
+    <w:p/>
     <w:p>
       <w:pPr>
         <w:pStyle w:val="ListBullet"/>
@@ -231,6 +317,7 @@
         <w:t>DIALOGUE-VIDA-0001</w:t>
       </w:r>
     </w:p>
+    <w:p/>
     <w:p>
       <w:pPr>
         <w:pStyle w:val="Heading2"/>
@@ -239,6 +326,7 @@
         <w:t>Referências cruzadas</w:t>
       </w:r>
     </w:p>
+    <w:p/>
     <w:p>
       <w:pPr>
         <w:pStyle w:val="ListBullet"/>
@@ -279,6 +367,7 @@
         <w:t>DIALOGUE-VIDA-0001</w:t>
       </w:r>
     </w:p>
+    <w:p/>
     <w:p>
       <w:pPr>
         <w:pStyle w:val="Heading2"/>
@@ -287,6 +376,7 @@
         <w:t>Referências</w:t>
       </w:r>
     </w:p>
+    <w:p/>
     <w:p>
       <w:pPr>
         <w:pStyle w:val="ListBullet"/>
@@ -295,6 +385,7 @@
         <w:t>Documento interno: `EDITORIAL_RULES.md`</w:t>
       </w:r>
     </w:p>
+    <w:p/>
     <w:p>
       <w:pPr>
         <w:pStyle w:val="Heading2"/>
@@ -303,6 +394,7 @@
         <w:t>Tags</w:t>
       </w:r>
     </w:p>
+    <w:p/>
     <w:p>
       <w:pPr>
         <w:pStyle w:val="ListBullet"/>
@@ -335,6 +427,7 @@
         <w:t>atendimento</w:t>
       </w:r>
     </w:p>
+    <w:p/>
     <w:p>
       <w:pPr>
         <w:pStyle w:val="Heading2"/>
@@ -343,6 +436,7 @@
         <w:t>Veja também</w:t>
       </w:r>
     </w:p>
+    <w:p/>
     <w:p>
       <w:pPr>
         <w:pStyle w:val="ListBullet"/>
@@ -351,6 +445,7 @@
         <w:t>`14_FAQ/VIDA/FAQ-VIDA-0001.md`</w:t>
       </w:r>
     </w:p>
+    <w:p/>
     <w:p>
       <w:pPr>
         <w:pStyle w:val="Heading2"/>
@@ -359,6 +454,7 @@
         <w:t>Histórico de revisão</w:t>
       </w:r>
     </w:p>
+    <w:p/>
     <w:p>
       <w:r>
         <w:t>| Data | Versão | Autor | Alteração |</w:t>
@@ -376,9 +472,16 @@
     </w:p>
     <w:p>
       <w:r>
-        <w:t>————————————————————————</w:t>
-      </w:r>
-    </w:p>
+        <w:t>| 2026-06-26 | 0.2 | JP-BR Insurance Knowledge Base | Inclusão de limite comercial/compliance para uso seguro em atendimento e NotebookLM. |</w:t>
+      </w:r>
+    </w:p>
+    <w:p/>
+    <w:p>
+      <w:r>
+        <w:br w:type="page"/>
+      </w:r>
+    </w:p>
+    <w:p/>
     <w:p>
       <w:pPr>
         <w:pStyle w:val="Heading1"/>
@@ -387,6 +490,7 @@
         <w:t>CASE-VIDA-0002 - Cliente compara seguro temporário e vitalício</w:t>
       </w:r>
     </w:p>
+    <w:p/>
     <w:p>
       <w:pPr>
         <w:pStyle w:val="Heading2"/>
@@ -395,12 +499,13 @@
         <w:t>Controle</w:t>
       </w:r>
     </w:p>
+    <w:p/>
     <w:p>
       <w:pPr>
         <w:pStyle w:val="ListBullet"/>
       </w:pPr>
       <w:r>
-        <w:t>Versão: 0.1</w:t>
+        <w:t>Versão: 0.2</w:t>
       </w:r>
     </w:p>
     <w:p>
@@ -424,9 +529,10 @@
         <w:pStyle w:val="ListBullet"/>
       </w:pPr>
       <w:r>
-        <w:t>Histórico: Criação inicial.</w:t>
-      </w:r>
-    </w:p>
+        <w:t>Histórico: Criação inicial; inclusão de limite comercial/compliance.</w:t>
+      </w:r>
+    </w:p>
+    <w:p/>
     <w:p>
       <w:pPr>
         <w:pStyle w:val="Heading2"/>
@@ -435,11 +541,13 @@
         <w:t>Código</w:t>
       </w:r>
     </w:p>
+    <w:p/>
     <w:p>
       <w:r>
         <w:t>CASE-VIDA-0002</w:t>
       </w:r>
     </w:p>
+    <w:p/>
     <w:p>
       <w:pPr>
         <w:pStyle w:val="Heading2"/>
@@ -448,11 +556,13 @@
         <w:t>Produto ou categoria</w:t>
       </w:r>
     </w:p>
+    <w:p/>
     <w:p>
       <w:r>
         <w:t>VIDA</w:t>
       </w:r>
     </w:p>
+    <w:p/>
     <w:p>
       <w:pPr>
         <w:pStyle w:val="Heading2"/>
@@ -461,11 +571,13 @@
         <w:t>Situação</w:t>
       </w:r>
     </w:p>
+    <w:p/>
     <w:p>
       <w:r>
         <w:t>Cliente compara seguro temporário e vitalício.</w:t>
       </w:r>
     </w:p>
+    <w:p/>
     <w:p>
       <w:pPr>
         <w:pStyle w:val="Heading2"/>
@@ -474,11 +586,13 @@
         <w:t>Problema</w:t>
       </w:r>
     </w:p>
+    <w:p/>
     <w:p>
       <w:r>
         <w:t>Cliente pode escolher cobertura inadequada por não entender finalidade, papéis contratuais, períodos ou regras iniciais do seguro de vida.</w:t>
       </w:r>
     </w:p>
+    <w:p/>
     <w:p>
       <w:pPr>
         <w:pStyle w:val="Heading2"/>
@@ -487,11 +601,13 @@
         <w:t>Análise</w:t>
       </w:r>
     </w:p>
+    <w:p/>
     <w:p>
       <w:r>
         <w:t>Seguro de vida deve ser explicado a partir da finalidade de proteção, pessoas envolvidas, valor de cobertura, prêmio, período e condições de aceitação.</w:t>
       </w:r>
     </w:p>
+    <w:p/>
     <w:p>
       <w:pPr>
         <w:pStyle w:val="Heading2"/>
@@ -500,11 +616,13 @@
         <w:t>Orientação ao corretor</w:t>
       </w:r>
     </w:p>
+    <w:p/>
     <w:p>
       <w:r>
         <w:t>Confirmar objetivo do cliente, estrutura familiar, orçamento, necessidade de proteção e entendimento sobre declaração de saúde e início da cobertura.</w:t>
       </w:r>
     </w:p>
+    <w:p/>
     <w:p>
       <w:pPr>
         <w:pStyle w:val="Heading2"/>
@@ -513,11 +631,13 @@
         <w:t>Como explicar ao cliente brasileiro</w:t>
       </w:r>
     </w:p>
+    <w:p/>
     <w:p>
       <w:r>
         <w:t>Antes de escolher o seguro, precisamos entender quem será protegido, quem receberá o valor e quando a cobertura começa.</w:t>
       </w:r>
     </w:p>
+    <w:p/>
     <w:p>
       <w:pPr>
         <w:pStyle w:val="Heading2"/>
@@ -526,19 +646,37 @@
         <w:t>Resultado esperado</w:t>
       </w:r>
     </w:p>
+    <w:p/>
     <w:p>
       <w:r>
         <w:t>Cliente compreende os fundamentos e consegue comparar opções sem confundir tipos de cobertura.</w:t>
       </w:r>
     </w:p>
+    <w:p/>
     <w:p>
       <w:pPr>
         <w:pStyle w:val="Heading2"/>
       </w:pPr>
       <w:r>
+        <w:t>Limite comercial/compliance</w:t>
+      </w:r>
+    </w:p>
+    <w:p/>
+    <w:p>
+      <w:r>
+        <w:t>O corretor deve usar este caso como orientação de atendimento, sem prometer aceitação, cobertura, valor de indenização, prazo, benefício fiscal, manutenção de contrato ou resultado de análise. A decisão final depende da apólice, declaração de saúde, documentos, situação familiar, regras fiscais quando aplicáveis e avaliação da seguradora ou órgão competente.</w:t>
+      </w:r>
+    </w:p>
+    <w:p/>
+    <w:p>
+      <w:pPr>
+        <w:pStyle w:val="Heading2"/>
+      </w:pPr>
+      <w:r>
         <w:t>Termos relacionados</w:t>
       </w:r>
     </w:p>
+    <w:p/>
     <w:p>
       <w:pPr>
         <w:pStyle w:val="ListBullet"/>
@@ -555,6 +693,7 @@
         <w:t>VIDA-0004 - 終身保険 - Seguro vitalício</w:t>
       </w:r>
     </w:p>
+    <w:p/>
     <w:p>
       <w:pPr>
         <w:pStyle w:val="Heading2"/>
@@ -563,6 +702,7 @@
         <w:t>FAQs relacionadas</w:t>
       </w:r>
     </w:p>
+    <w:p/>
     <w:p>
       <w:pPr>
         <w:pStyle w:val="ListBullet"/>
@@ -579,6 +719,7 @@
         <w:t>FAQ-VIDA-0004</w:t>
       </w:r>
     </w:p>
+    <w:p/>
     <w:p>
       <w:pPr>
         <w:pStyle w:val="Heading2"/>
@@ -587,6 +728,7 @@
         <w:t>Diálogos relacionados</w:t>
       </w:r>
     </w:p>
+    <w:p/>
     <w:p>
       <w:pPr>
         <w:pStyle w:val="ListBullet"/>
@@ -595,6 +737,7 @@
         <w:t>DIALOGUE-VIDA-0001</w:t>
       </w:r>
     </w:p>
+    <w:p/>
     <w:p>
       <w:pPr>
         <w:pStyle w:val="Heading2"/>
@@ -603,6 +746,7 @@
         <w:t>Referências cruzadas</w:t>
       </w:r>
     </w:p>
+    <w:p/>
     <w:p>
       <w:pPr>
         <w:pStyle w:val="ListBullet"/>
@@ -643,6 +787,7 @@
         <w:t>DIALOGUE-VIDA-0001</w:t>
       </w:r>
     </w:p>
+    <w:p/>
     <w:p>
       <w:pPr>
         <w:pStyle w:val="Heading2"/>
@@ -651,6 +796,7 @@
         <w:t>Referências</w:t>
       </w:r>
     </w:p>
+    <w:p/>
     <w:p>
       <w:pPr>
         <w:pStyle w:val="ListBullet"/>
@@ -659,6 +805,7 @@
         <w:t>Documento interno: `EDITORIAL_RULES.md`</w:t>
       </w:r>
     </w:p>
+    <w:p/>
     <w:p>
       <w:pPr>
         <w:pStyle w:val="Heading2"/>
@@ -667,6 +814,7 @@
         <w:t>Tags</w:t>
       </w:r>
     </w:p>
+    <w:p/>
     <w:p>
       <w:pPr>
         <w:pStyle w:val="ListBullet"/>
@@ -699,6 +847,7 @@
         <w:t>atendimento</w:t>
       </w:r>
     </w:p>
+    <w:p/>
     <w:p>
       <w:pPr>
         <w:pStyle w:val="Heading2"/>
@@ -707,6 +856,7 @@
         <w:t>Veja também</w:t>
       </w:r>
     </w:p>
+    <w:p/>
     <w:p>
       <w:pPr>
         <w:pStyle w:val="ListBullet"/>
@@ -715,6 +865,7 @@
         <w:t>`14_FAQ/VIDA/FAQ-VIDA-0003.md`</w:t>
       </w:r>
     </w:p>
+    <w:p/>
     <w:p>
       <w:pPr>
         <w:pStyle w:val="Heading2"/>
@@ -723,6 +874,7 @@
         <w:t>Histórico de revisão</w:t>
       </w:r>
     </w:p>
+    <w:p/>
     <w:p>
       <w:r>
         <w:t>| Data | Versão | Autor | Alteração |</w:t>
@@ -740,9 +892,16 @@
     </w:p>
     <w:p>
       <w:r>
-        <w:t>————————————————————————</w:t>
-      </w:r>
-    </w:p>
+        <w:t>| 2026-06-26 | 0.2 | JP-BR Insurance Knowledge Base | Inclusão de limite comercial/compliance para uso seguro em atendimento e NotebookLM. |</w:t>
+      </w:r>
+    </w:p>
+    <w:p/>
+    <w:p>
+      <w:r>
+        <w:br w:type="page"/>
+      </w:r>
+    </w:p>
+    <w:p/>
     <w:p>
       <w:pPr>
         <w:pStyle w:val="Heading1"/>
@@ -751,6 +910,7 @@
         <w:t>CASE-VIDA-0003 - Cliente confunde seguro de vida, médico e câncer</w:t>
       </w:r>
     </w:p>
+    <w:p/>
     <w:p>
       <w:pPr>
         <w:pStyle w:val="Heading2"/>
@@ -759,12 +919,13 @@
         <w:t>Controle</w:t>
       </w:r>
     </w:p>
+    <w:p/>
     <w:p>
       <w:pPr>
         <w:pStyle w:val="ListBullet"/>
       </w:pPr>
       <w:r>
-        <w:t>Versão: 0.1</w:t>
+        <w:t>Versão: 0.2</w:t>
       </w:r>
     </w:p>
     <w:p>
@@ -788,9 +949,10 @@
         <w:pStyle w:val="ListBullet"/>
       </w:pPr>
       <w:r>
-        <w:t>Histórico: Criação inicial.</w:t>
-      </w:r>
-    </w:p>
+        <w:t>Histórico: Criação inicial; inclusão de limite comercial/compliance.</w:t>
+      </w:r>
+    </w:p>
+    <w:p/>
     <w:p>
       <w:pPr>
         <w:pStyle w:val="Heading2"/>
@@ -799,11 +961,13 @@
         <w:t>Código</w:t>
       </w:r>
     </w:p>
+    <w:p/>
     <w:p>
       <w:r>
         <w:t>CASE-VIDA-0003</w:t>
       </w:r>
     </w:p>
+    <w:p/>
     <w:p>
       <w:pPr>
         <w:pStyle w:val="Heading2"/>
@@ -812,11 +976,13 @@
         <w:t>Produto ou categoria</w:t>
       </w:r>
     </w:p>
+    <w:p/>
     <w:p>
       <w:r>
         <w:t>VIDA</w:t>
       </w:r>
     </w:p>
+    <w:p/>
     <w:p>
       <w:pPr>
         <w:pStyle w:val="Heading2"/>
@@ -825,11 +991,13 @@
         <w:t>Situação</w:t>
       </w:r>
     </w:p>
+    <w:p/>
     <w:p>
       <w:r>
         <w:t>Cliente confunde seguro de vida, médico e câncer.</w:t>
       </w:r>
     </w:p>
+    <w:p/>
     <w:p>
       <w:pPr>
         <w:pStyle w:val="Heading2"/>
@@ -838,11 +1006,13 @@
         <w:t>Problema</w:t>
       </w:r>
     </w:p>
+    <w:p/>
     <w:p>
       <w:r>
         <w:t>Cliente pode escolher cobertura inadequada por não entender finalidade, papéis contratuais, períodos ou regras iniciais do seguro de vida.</w:t>
       </w:r>
     </w:p>
+    <w:p/>
     <w:p>
       <w:pPr>
         <w:pStyle w:val="Heading2"/>
@@ -851,11 +1021,13 @@
         <w:t>Análise</w:t>
       </w:r>
     </w:p>
+    <w:p/>
     <w:p>
       <w:r>
         <w:t>Seguro de vida deve ser explicado a partir da finalidade de proteção, pessoas envolvidas, valor de cobertura, prêmio, período e condições de aceitação.</w:t>
       </w:r>
     </w:p>
+    <w:p/>
     <w:p>
       <w:pPr>
         <w:pStyle w:val="Heading2"/>
@@ -864,11 +1036,13 @@
         <w:t>Orientação ao corretor</w:t>
       </w:r>
     </w:p>
+    <w:p/>
     <w:p>
       <w:r>
         <w:t>Confirmar objetivo do cliente, estrutura familiar, orçamento, necessidade de proteção e entendimento sobre declaração de saúde e início da cobertura.</w:t>
       </w:r>
     </w:p>
+    <w:p/>
     <w:p>
       <w:pPr>
         <w:pStyle w:val="Heading2"/>
@@ -877,11 +1051,13 @@
         <w:t>Como explicar ao cliente brasileiro</w:t>
       </w:r>
     </w:p>
+    <w:p/>
     <w:p>
       <w:r>
         <w:t>Antes de escolher o seguro, precisamos entender quem será protegido, quem receberá o valor e quando a cobertura começa.</w:t>
       </w:r>
     </w:p>
+    <w:p/>
     <w:p>
       <w:pPr>
         <w:pStyle w:val="Heading2"/>
@@ -890,19 +1066,37 @@
         <w:t>Resultado esperado</w:t>
       </w:r>
     </w:p>
+    <w:p/>
     <w:p>
       <w:r>
         <w:t>Cliente compreende os fundamentos e consegue comparar opções sem confundir tipos de cobertura.</w:t>
       </w:r>
     </w:p>
+    <w:p/>
     <w:p>
       <w:pPr>
         <w:pStyle w:val="Heading2"/>
       </w:pPr>
       <w:r>
+        <w:t>Limite comercial/compliance</w:t>
+      </w:r>
+    </w:p>
+    <w:p/>
+    <w:p>
+      <w:r>
+        <w:t>O corretor deve usar este caso como orientação de atendimento, sem prometer aceitação, cobertura, valor de indenização, prazo, benefício fiscal, manutenção de contrato ou resultado de análise. A decisão final depende da apólice, declaração de saúde, documentos, situação familiar, regras fiscais quando aplicáveis e avaliação da seguradora ou órgão competente.</w:t>
+      </w:r>
+    </w:p>
+    <w:p/>
+    <w:p>
+      <w:pPr>
+        <w:pStyle w:val="Heading2"/>
+      </w:pPr>
+      <w:r>
         <w:t>Termos relacionados</w:t>
       </w:r>
     </w:p>
+    <w:p/>
     <w:p>
       <w:pPr>
         <w:pStyle w:val="ListBullet"/>
@@ -935,6 +1129,7 @@
         <w:t>VIDA-0008 - 就業不能保険 - Seguro por incapacidade de trabalhar</w:t>
       </w:r>
     </w:p>
+    <w:p/>
     <w:p>
       <w:pPr>
         <w:pStyle w:val="Heading2"/>
@@ -943,6 +1138,7 @@
         <w:t>FAQs relacionadas</w:t>
       </w:r>
     </w:p>
+    <w:p/>
     <w:p>
       <w:pPr>
         <w:pStyle w:val="ListBullet"/>
@@ -975,6 +1171,7 @@
         <w:t>FAQ-VIDA-0008</w:t>
       </w:r>
     </w:p>
+    <w:p/>
     <w:p>
       <w:pPr>
         <w:pStyle w:val="Heading2"/>
@@ -983,6 +1180,7 @@
         <w:t>Diálogos relacionados</w:t>
       </w:r>
     </w:p>
+    <w:p/>
     <w:p>
       <w:pPr>
         <w:pStyle w:val="ListBullet"/>
@@ -991,6 +1189,7 @@
         <w:t>DIALOGUE-VIDA-0002</w:t>
       </w:r>
     </w:p>
+    <w:p/>
     <w:p>
       <w:pPr>
         <w:pStyle w:val="Heading2"/>
@@ -999,6 +1198,7 @@
         <w:t>Referências cruzadas</w:t>
       </w:r>
     </w:p>
+    <w:p/>
     <w:p>
       <w:pPr>
         <w:pStyle w:val="ListBullet"/>
@@ -1071,6 +1271,7 @@
         <w:t>DIALOGUE-VIDA-0002</w:t>
       </w:r>
     </w:p>
+    <w:p/>
     <w:p>
       <w:pPr>
         <w:pStyle w:val="Heading2"/>
@@ -1079,6 +1280,7 @@
         <w:t>Referências</w:t>
       </w:r>
     </w:p>
+    <w:p/>
     <w:p>
       <w:pPr>
         <w:pStyle w:val="ListBullet"/>
@@ -1087,6 +1289,7 @@
         <w:t>Documento interno: `EDITORIAL_RULES.md`</w:t>
       </w:r>
     </w:p>
+    <w:p/>
     <w:p>
       <w:pPr>
         <w:pStyle w:val="Heading2"/>
@@ -1095,6 +1298,7 @@
         <w:t>Tags</w:t>
       </w:r>
     </w:p>
+    <w:p/>
     <w:p>
       <w:pPr>
         <w:pStyle w:val="ListBullet"/>
@@ -1127,6 +1331,7 @@
         <w:t>atendimento</w:t>
       </w:r>
     </w:p>
+    <w:p/>
     <w:p>
       <w:pPr>
         <w:pStyle w:val="Heading2"/>
@@ -1135,6 +1340,7 @@
         <w:t>Veja também</w:t>
       </w:r>
     </w:p>
+    <w:p/>
     <w:p>
       <w:pPr>
         <w:pStyle w:val="ListBullet"/>
@@ -1143,6 +1349,7 @@
         <w:t>`14_FAQ/VIDA/FAQ-VIDA-0005.md`</w:t>
       </w:r>
     </w:p>
+    <w:p/>
     <w:p>
       <w:pPr>
         <w:pStyle w:val="Heading2"/>
@@ -1151,6 +1358,7 @@
         <w:t>Histórico de revisão</w:t>
       </w:r>
     </w:p>
+    <w:p/>
     <w:p>
       <w:r>
         <w:t>| Data | Versão | Autor | Alteração |</w:t>
@@ -1168,9 +1376,16 @@
     </w:p>
     <w:p>
       <w:r>
-        <w:t>————————————————————————</w:t>
-      </w:r>
-    </w:p>
+        <w:t>| 2026-06-26 | 0.2 | JP-BR Insurance Knowledge Base | Inclusão de limite comercial/compliance para uso seguro em atendimento e NotebookLM. |</w:t>
+      </w:r>
+    </w:p>
+    <w:p/>
+    <w:p>
+      <w:r>
+        <w:br w:type="page"/>
+      </w:r>
+    </w:p>
+    <w:p/>
     <w:p>
       <w:pPr>
         <w:pStyle w:val="Heading1"/>
@@ -1179,6 +1394,7 @@
         <w:t>CASE-VIDA-0004 - Família precisa definir beneficiário corretamente</w:t>
       </w:r>
     </w:p>
+    <w:p/>
     <w:p>
       <w:pPr>
         <w:pStyle w:val="Heading2"/>
@@ -1187,12 +1403,13 @@
         <w:t>Controle</w:t>
       </w:r>
     </w:p>
+    <w:p/>
     <w:p>
       <w:pPr>
         <w:pStyle w:val="ListBullet"/>
       </w:pPr>
       <w:r>
-        <w:t>Versão: 0.1</w:t>
+        <w:t>Versão: 0.2</w:t>
       </w:r>
     </w:p>
     <w:p>
@@ -1216,9 +1433,10 @@
         <w:pStyle w:val="ListBullet"/>
       </w:pPr>
       <w:r>
-        <w:t>Histórico: Criação inicial.</w:t>
-      </w:r>
-    </w:p>
+        <w:t>Histórico: Criação inicial; inclusão de limite comercial/compliance.</w:t>
+      </w:r>
+    </w:p>
+    <w:p/>
     <w:p>
       <w:pPr>
         <w:pStyle w:val="Heading2"/>
@@ -1227,11 +1445,13 @@
         <w:t>Código</w:t>
       </w:r>
     </w:p>
+    <w:p/>
     <w:p>
       <w:r>
         <w:t>CASE-VIDA-0004</w:t>
       </w:r>
     </w:p>
+    <w:p/>
     <w:p>
       <w:pPr>
         <w:pStyle w:val="Heading2"/>
@@ -1240,11 +1460,13 @@
         <w:t>Produto ou categoria</w:t>
       </w:r>
     </w:p>
+    <w:p/>
     <w:p>
       <w:r>
         <w:t>VIDA</w:t>
       </w:r>
     </w:p>
+    <w:p/>
     <w:p>
       <w:pPr>
         <w:pStyle w:val="Heading2"/>
@@ -1253,11 +1475,13 @@
         <w:t>Situação</w:t>
       </w:r>
     </w:p>
+    <w:p/>
     <w:p>
       <w:r>
         <w:t>Família precisa definir beneficiário corretamente.</w:t>
       </w:r>
     </w:p>
+    <w:p/>
     <w:p>
       <w:pPr>
         <w:pStyle w:val="Heading2"/>
@@ -1266,11 +1490,13 @@
         <w:t>Problema</w:t>
       </w:r>
     </w:p>
+    <w:p/>
     <w:p>
       <w:r>
         <w:t>Cliente pode escolher cobertura inadequada por não entender finalidade, papéis contratuais, períodos ou regras iniciais do seguro de vida.</w:t>
       </w:r>
     </w:p>
+    <w:p/>
     <w:p>
       <w:pPr>
         <w:pStyle w:val="Heading2"/>
@@ -1279,11 +1505,13 @@
         <w:t>Análise</w:t>
       </w:r>
     </w:p>
+    <w:p/>
     <w:p>
       <w:r>
         <w:t>Seguro de vida deve ser explicado a partir da finalidade de proteção, pessoas envolvidas, valor de cobertura, prêmio, período e condições de aceitação.</w:t>
       </w:r>
     </w:p>
+    <w:p/>
     <w:p>
       <w:pPr>
         <w:pStyle w:val="Heading2"/>
@@ -1292,11 +1520,13 @@
         <w:t>Orientação ao corretor</w:t>
       </w:r>
     </w:p>
+    <w:p/>
     <w:p>
       <w:r>
         <w:t>Confirmar objetivo do cliente, estrutura familiar, orçamento, necessidade de proteção e entendimento sobre declaração de saúde e início da cobertura.</w:t>
       </w:r>
     </w:p>
+    <w:p/>
     <w:p>
       <w:pPr>
         <w:pStyle w:val="Heading2"/>
@@ -1305,11 +1535,13 @@
         <w:t>Como explicar ao cliente brasileiro</w:t>
       </w:r>
     </w:p>
+    <w:p/>
     <w:p>
       <w:r>
         <w:t>Antes de escolher o seguro, precisamos entender quem será protegido, quem receberá o valor e quando a cobertura começa.</w:t>
       </w:r>
     </w:p>
+    <w:p/>
     <w:p>
       <w:pPr>
         <w:pStyle w:val="Heading2"/>
@@ -1318,19 +1550,37 @@
         <w:t>Resultado esperado</w:t>
       </w:r>
     </w:p>
+    <w:p/>
     <w:p>
       <w:r>
         <w:t>Cliente compreende os fundamentos e consegue comparar opções sem confundir tipos de cobertura.</w:t>
       </w:r>
     </w:p>
+    <w:p/>
     <w:p>
       <w:pPr>
         <w:pStyle w:val="Heading2"/>
       </w:pPr>
       <w:r>
+        <w:t>Limite comercial/compliance</w:t>
+      </w:r>
+    </w:p>
+    <w:p/>
+    <w:p>
+      <w:r>
+        <w:t>O corretor deve usar este caso como orientação de atendimento, sem prometer aceitação, cobertura, valor de indenização, prazo, benefício fiscal, manutenção de contrato ou resultado de análise. A decisão final depende da apólice, declaração de saúde, documentos, situação familiar, regras fiscais quando aplicáveis e avaliação da seguradora ou órgão competente.</w:t>
+      </w:r>
+    </w:p>
+    <w:p/>
+    <w:p>
+      <w:pPr>
+        <w:pStyle w:val="Heading2"/>
+      </w:pPr>
+      <w:r>
         <w:t>Termos relacionados</w:t>
       </w:r>
     </w:p>
+    <w:p/>
     <w:p>
       <w:pPr>
         <w:pStyle w:val="ListBullet"/>
@@ -1355,6 +1605,7 @@
         <w:t>VIDA-0011 - 受取人 - Beneficiário</w:t>
       </w:r>
     </w:p>
+    <w:p/>
     <w:p>
       <w:pPr>
         <w:pStyle w:val="Heading2"/>
@@ -1363,6 +1614,7 @@
         <w:t>FAQs relacionadas</w:t>
       </w:r>
     </w:p>
+    <w:p/>
     <w:p>
       <w:pPr>
         <w:pStyle w:val="ListBullet"/>
@@ -1387,6 +1639,7 @@
         <w:t>FAQ-VIDA-0011</w:t>
       </w:r>
     </w:p>
+    <w:p/>
     <w:p>
       <w:pPr>
         <w:pStyle w:val="Heading2"/>
@@ -1395,6 +1648,7 @@
         <w:t>Diálogos relacionados</w:t>
       </w:r>
     </w:p>
+    <w:p/>
     <w:p>
       <w:pPr>
         <w:pStyle w:val="ListBullet"/>
@@ -1403,6 +1657,7 @@
         <w:t>DIALOGUE-VIDA-0003</w:t>
       </w:r>
     </w:p>
+    <w:p/>
     <w:p>
       <w:pPr>
         <w:pStyle w:val="Heading2"/>
@@ -1411,6 +1666,7 @@
         <w:t>Referências cruzadas</w:t>
       </w:r>
     </w:p>
+    <w:p/>
     <w:p>
       <w:pPr>
         <w:pStyle w:val="ListBullet"/>
@@ -1467,6 +1723,7 @@
         <w:t>DIALOGUE-VIDA-0003</w:t>
       </w:r>
     </w:p>
+    <w:p/>
     <w:p>
       <w:pPr>
         <w:pStyle w:val="Heading2"/>
@@ -1475,6 +1732,7 @@
         <w:t>Referências</w:t>
       </w:r>
     </w:p>
+    <w:p/>
     <w:p>
       <w:pPr>
         <w:pStyle w:val="ListBullet"/>
@@ -1483,6 +1741,7 @@
         <w:t>Documento interno: `EDITORIAL_RULES.md`</w:t>
       </w:r>
     </w:p>
+    <w:p/>
     <w:p>
       <w:pPr>
         <w:pStyle w:val="Heading2"/>
@@ -1491,6 +1750,7 @@
         <w:t>Tags</w:t>
       </w:r>
     </w:p>
+    <w:p/>
     <w:p>
       <w:pPr>
         <w:pStyle w:val="ListBullet"/>
@@ -1523,6 +1783,7 @@
         <w:t>atendimento</w:t>
       </w:r>
     </w:p>
+    <w:p/>
     <w:p>
       <w:pPr>
         <w:pStyle w:val="Heading2"/>
@@ -1531,6 +1792,7 @@
         <w:t>Veja também</w:t>
       </w:r>
     </w:p>
+    <w:p/>
     <w:p>
       <w:pPr>
         <w:pStyle w:val="ListBullet"/>
@@ -1539,6 +1801,7 @@
         <w:t>`14_FAQ/VIDA/FAQ-VIDA-0009.md`</w:t>
       </w:r>
     </w:p>
+    <w:p/>
     <w:p>
       <w:pPr>
         <w:pStyle w:val="Heading2"/>
@@ -1547,6 +1810,7 @@
         <w:t>Histórico de revisão</w:t>
       </w:r>
     </w:p>
+    <w:p/>
     <w:p>
       <w:r>
         <w:t>| Data | Versão | Autor | Alteração |</w:t>
@@ -1564,9 +1828,16 @@
     </w:p>
     <w:p>
       <w:r>
-        <w:t>————————————————————————</w:t>
-      </w:r>
-    </w:p>
+        <w:t>| 2026-06-26 | 0.2 | JP-BR Insurance Knowledge Base | Inclusão de limite comercial/compliance para uso seguro em atendimento e NotebookLM. |</w:t>
+      </w:r>
+    </w:p>
+    <w:p/>
+    <w:p>
+      <w:r>
+        <w:br w:type="page"/>
+      </w:r>
+    </w:p>
+    <w:p/>
     <w:p>
       <w:pPr>
         <w:pStyle w:val="Heading1"/>
@@ -1575,6 +1846,7 @@
         <w:t>CASE-VIDA-0005 - Cliente não entende diferença entre indenização e benefício</w:t>
       </w:r>
     </w:p>
+    <w:p/>
     <w:p>
       <w:pPr>
         <w:pStyle w:val="Heading2"/>
@@ -1583,12 +1855,13 @@
         <w:t>Controle</w:t>
       </w:r>
     </w:p>
+    <w:p/>
     <w:p>
       <w:pPr>
         <w:pStyle w:val="ListBullet"/>
       </w:pPr>
       <w:r>
-        <w:t>Versão: 0.1</w:t>
+        <w:t>Versão: 0.2</w:t>
       </w:r>
     </w:p>
     <w:p>
@@ -1612,9 +1885,10 @@
         <w:pStyle w:val="ListBullet"/>
       </w:pPr>
       <w:r>
-        <w:t>Histórico: Criação inicial.</w:t>
-      </w:r>
-    </w:p>
+        <w:t>Histórico: Criação inicial; inclusão de limite comercial/compliance.</w:t>
+      </w:r>
+    </w:p>
+    <w:p/>
     <w:p>
       <w:pPr>
         <w:pStyle w:val="Heading2"/>
@@ -1623,11 +1897,13 @@
         <w:t>Código</w:t>
       </w:r>
     </w:p>
+    <w:p/>
     <w:p>
       <w:r>
         <w:t>CASE-VIDA-0005</w:t>
       </w:r>
     </w:p>
+    <w:p/>
     <w:p>
       <w:pPr>
         <w:pStyle w:val="Heading2"/>
@@ -1636,11 +1912,13 @@
         <w:t>Produto ou categoria</w:t>
       </w:r>
     </w:p>
+    <w:p/>
     <w:p>
       <w:r>
         <w:t>VIDA</w:t>
       </w:r>
     </w:p>
+    <w:p/>
     <w:p>
       <w:pPr>
         <w:pStyle w:val="Heading2"/>
@@ -1649,11 +1927,13 @@
         <w:t>Situação</w:t>
       </w:r>
     </w:p>
+    <w:p/>
     <w:p>
       <w:r>
         <w:t>Cliente não entende diferença entre indenização e benefício.</w:t>
       </w:r>
     </w:p>
+    <w:p/>
     <w:p>
       <w:pPr>
         <w:pStyle w:val="Heading2"/>
@@ -1662,11 +1942,13 @@
         <w:t>Problema</w:t>
       </w:r>
     </w:p>
+    <w:p/>
     <w:p>
       <w:r>
         <w:t>Cliente pode escolher cobertura inadequada por não entender finalidade, papéis contratuais, períodos ou regras iniciais do seguro de vida.</w:t>
       </w:r>
     </w:p>
+    <w:p/>
     <w:p>
       <w:pPr>
         <w:pStyle w:val="Heading2"/>
@@ -1675,11 +1957,13 @@
         <w:t>Análise</w:t>
       </w:r>
     </w:p>
+    <w:p/>
     <w:p>
       <w:r>
         <w:t>Seguro de vida deve ser explicado a partir da finalidade de proteção, pessoas envolvidas, valor de cobertura, prêmio, período e condições de aceitação.</w:t>
       </w:r>
     </w:p>
+    <w:p/>
     <w:p>
       <w:pPr>
         <w:pStyle w:val="Heading2"/>
@@ -1688,11 +1972,13 @@
         <w:t>Orientação ao corretor</w:t>
       </w:r>
     </w:p>
+    <w:p/>
     <w:p>
       <w:r>
         <w:t>Confirmar objetivo do cliente, estrutura familiar, orçamento, necessidade de proteção e entendimento sobre declaração de saúde e início da cobertura.</w:t>
       </w:r>
     </w:p>
+    <w:p/>
     <w:p>
       <w:pPr>
         <w:pStyle w:val="Heading2"/>
@@ -1701,11 +1987,13 @@
         <w:t>Como explicar ao cliente brasileiro</w:t>
       </w:r>
     </w:p>
+    <w:p/>
     <w:p>
       <w:r>
         <w:t>Antes de escolher o seguro, precisamos entender quem será protegido, quem receberá o valor e quando a cobertura começa.</w:t>
       </w:r>
     </w:p>
+    <w:p/>
     <w:p>
       <w:pPr>
         <w:pStyle w:val="Heading2"/>
@@ -1714,19 +2002,37 @@
         <w:t>Resultado esperado</w:t>
       </w:r>
     </w:p>
+    <w:p/>
     <w:p>
       <w:r>
         <w:t>Cliente compreende os fundamentos e consegue comparar opções sem confundir tipos de cobertura.</w:t>
       </w:r>
     </w:p>
+    <w:p/>
     <w:p>
       <w:pPr>
         <w:pStyle w:val="Heading2"/>
       </w:pPr>
       <w:r>
+        <w:t>Limite comercial/compliance</w:t>
+      </w:r>
+    </w:p>
+    <w:p/>
+    <w:p>
+      <w:r>
+        <w:t>O corretor deve usar este caso como orientação de atendimento, sem prometer aceitação, cobertura, valor de indenização, prazo, benefício fiscal, manutenção de contrato ou resultado de análise. A decisão final depende da apólice, declaração de saúde, documentos, situação familiar, regras fiscais quando aplicáveis e avaliação da seguradora ou órgão competente.</w:t>
+      </w:r>
+    </w:p>
+    <w:p/>
+    <w:p>
+      <w:pPr>
+        <w:pStyle w:val="Heading2"/>
+      </w:pPr>
+      <w:r>
         <w:t>Termos relacionados</w:t>
       </w:r>
     </w:p>
+    <w:p/>
     <w:p>
       <w:pPr>
         <w:pStyle w:val="ListBullet"/>
@@ -1743,6 +2049,7 @@
         <w:t>VIDA-0013 - 給付金 - Benefício pago pelo seguro</w:t>
       </w:r>
     </w:p>
+    <w:p/>
     <w:p>
       <w:pPr>
         <w:pStyle w:val="Heading2"/>
@@ -1751,6 +2058,7 @@
         <w:t>FAQs relacionadas</w:t>
       </w:r>
     </w:p>
+    <w:p/>
     <w:p>
       <w:pPr>
         <w:pStyle w:val="ListBullet"/>
@@ -1767,6 +2075,7 @@
         <w:t>FAQ-VIDA-0013</w:t>
       </w:r>
     </w:p>
+    <w:p/>
     <w:p>
       <w:pPr>
         <w:pStyle w:val="Heading2"/>
@@ -1775,6 +2084,7 @@
         <w:t>Diálogos relacionados</w:t>
       </w:r>
     </w:p>
+    <w:p/>
     <w:p>
       <w:pPr>
         <w:pStyle w:val="ListBullet"/>
@@ -1791,6 +2101,7 @@
         <w:t>DIALOGUE-VIDA-0004</w:t>
       </w:r>
     </w:p>
+    <w:p/>
     <w:p>
       <w:pPr>
         <w:pStyle w:val="Heading2"/>
@@ -1799,6 +2110,7 @@
         <w:t>Referências cruzadas</w:t>
       </w:r>
     </w:p>
+    <w:p/>
     <w:p>
       <w:pPr>
         <w:pStyle w:val="ListBullet"/>
@@ -1847,6 +2159,7 @@
         <w:t>DIALOGUE-VIDA-0004</w:t>
       </w:r>
     </w:p>
+    <w:p/>
     <w:p>
       <w:pPr>
         <w:pStyle w:val="Heading2"/>
@@ -1855,6 +2168,7 @@
         <w:t>Referências</w:t>
       </w:r>
     </w:p>
+    <w:p/>
     <w:p>
       <w:pPr>
         <w:pStyle w:val="ListBullet"/>
@@ -1863,6 +2177,7 @@
         <w:t>Documento interno: `EDITORIAL_RULES.md`</w:t>
       </w:r>
     </w:p>
+    <w:p/>
     <w:p>
       <w:pPr>
         <w:pStyle w:val="Heading2"/>
@@ -1871,6 +2186,7 @@
         <w:t>Tags</w:t>
       </w:r>
     </w:p>
+    <w:p/>
     <w:p>
       <w:pPr>
         <w:pStyle w:val="ListBullet"/>
@@ -1903,6 +2219,7 @@
         <w:t>atendimento</w:t>
       </w:r>
     </w:p>
+    <w:p/>
     <w:p>
       <w:pPr>
         <w:pStyle w:val="Heading2"/>
@@ -1911,6 +2228,7 @@
         <w:t>Veja também</w:t>
       </w:r>
     </w:p>
+    <w:p/>
     <w:p>
       <w:pPr>
         <w:pStyle w:val="ListBullet"/>
@@ -1919,6 +2237,7 @@
         <w:t>`14_FAQ/VIDA/FAQ-VIDA-0012.md`</w:t>
       </w:r>
     </w:p>
+    <w:p/>
     <w:p>
       <w:pPr>
         <w:pStyle w:val="Heading2"/>
@@ -1927,6 +2246,7 @@
         <w:t>Histórico de revisão</w:t>
       </w:r>
     </w:p>
+    <w:p/>
     <w:p>
       <w:r>
         <w:t>| Data | Versão | Autor | Alteração |</w:t>
@@ -1944,9 +2264,16 @@
     </w:p>
     <w:p>
       <w:r>
-        <w:t>————————————————————————</w:t>
-      </w:r>
-    </w:p>
+        <w:t>| 2026-06-26 | 0.2 | JP-BR Insurance Knowledge Base | Inclusão de limite comercial/compliance para uso seguro em atendimento e NotebookLM. |</w:t>
+      </w:r>
+    </w:p>
+    <w:p/>
+    <w:p>
+      <w:r>
+        <w:br w:type="page"/>
+      </w:r>
+    </w:p>
+    <w:p/>
     <w:p>
       <w:pPr>
         <w:pStyle w:val="Heading1"/>
@@ -1955,6 +2282,7 @@
         <w:t>CASE-VIDA-0006 - Cliente compara período de pagamento e período de cobertura</w:t>
       </w:r>
     </w:p>
+    <w:p/>
     <w:p>
       <w:pPr>
         <w:pStyle w:val="Heading2"/>
@@ -1963,12 +2291,13 @@
         <w:t>Controle</w:t>
       </w:r>
     </w:p>
+    <w:p/>
     <w:p>
       <w:pPr>
         <w:pStyle w:val="ListBullet"/>
       </w:pPr>
       <w:r>
-        <w:t>Versão: 0.1</w:t>
+        <w:t>Versão: 0.2</w:t>
       </w:r>
     </w:p>
     <w:p>
@@ -1992,9 +2321,10 @@
         <w:pStyle w:val="ListBullet"/>
       </w:pPr>
       <w:r>
-        <w:t>Histórico: Criação inicial.</w:t>
-      </w:r>
-    </w:p>
+        <w:t>Histórico: Criação inicial; inclusão de limite comercial/compliance.</w:t>
+      </w:r>
+    </w:p>
+    <w:p/>
     <w:p>
       <w:pPr>
         <w:pStyle w:val="Heading2"/>
@@ -2003,11 +2333,13 @@
         <w:t>Código</w:t>
       </w:r>
     </w:p>
+    <w:p/>
     <w:p>
       <w:r>
         <w:t>CASE-VIDA-0006</w:t>
       </w:r>
     </w:p>
+    <w:p/>
     <w:p>
       <w:pPr>
         <w:pStyle w:val="Heading2"/>
@@ -2016,11 +2348,13 @@
         <w:t>Produto ou categoria</w:t>
       </w:r>
     </w:p>
+    <w:p/>
     <w:p>
       <w:r>
         <w:t>VIDA</w:t>
       </w:r>
     </w:p>
+    <w:p/>
     <w:p>
       <w:pPr>
         <w:pStyle w:val="Heading2"/>
@@ -2029,11 +2363,13 @@
         <w:t>Situação</w:t>
       </w:r>
     </w:p>
+    <w:p/>
     <w:p>
       <w:r>
         <w:t>Cliente compara período de pagamento e período de cobertura.</w:t>
       </w:r>
     </w:p>
+    <w:p/>
     <w:p>
       <w:pPr>
         <w:pStyle w:val="Heading2"/>
@@ -2042,11 +2378,13 @@
         <w:t>Problema</w:t>
       </w:r>
     </w:p>
+    <w:p/>
     <w:p>
       <w:r>
         <w:t>Cliente pode escolher cobertura inadequada por não entender finalidade, papéis contratuais, períodos ou regras iniciais do seguro de vida.</w:t>
       </w:r>
     </w:p>
+    <w:p/>
     <w:p>
       <w:pPr>
         <w:pStyle w:val="Heading2"/>
@@ -2055,11 +2393,13 @@
         <w:t>Análise</w:t>
       </w:r>
     </w:p>
+    <w:p/>
     <w:p>
       <w:r>
         <w:t>Seguro de vida deve ser explicado a partir da finalidade de proteção, pessoas envolvidas, valor de cobertura, prêmio, período e condições de aceitação.</w:t>
       </w:r>
     </w:p>
+    <w:p/>
     <w:p>
       <w:pPr>
         <w:pStyle w:val="Heading2"/>
@@ -2068,11 +2408,13 @@
         <w:t>Orientação ao corretor</w:t>
       </w:r>
     </w:p>
+    <w:p/>
     <w:p>
       <w:r>
         <w:t>Confirmar objetivo do cliente, estrutura familiar, orçamento, necessidade de proteção e entendimento sobre declaração de saúde e início da cobertura.</w:t>
       </w:r>
     </w:p>
+    <w:p/>
     <w:p>
       <w:pPr>
         <w:pStyle w:val="Heading2"/>
@@ -2081,11 +2423,13 @@
         <w:t>Como explicar ao cliente brasileiro</w:t>
       </w:r>
     </w:p>
+    <w:p/>
     <w:p>
       <w:r>
         <w:t>Antes de escolher o seguro, precisamos entender quem será protegido, quem receberá o valor e quando a cobertura começa.</w:t>
       </w:r>
     </w:p>
+    <w:p/>
     <w:p>
       <w:pPr>
         <w:pStyle w:val="Heading2"/>
@@ -2094,19 +2438,37 @@
         <w:t>Resultado esperado</w:t>
       </w:r>
     </w:p>
+    <w:p/>
     <w:p>
       <w:r>
         <w:t>Cliente compreende os fundamentos e consegue comparar opções sem confundir tipos de cobertura.</w:t>
       </w:r>
     </w:p>
+    <w:p/>
     <w:p>
       <w:pPr>
         <w:pStyle w:val="Heading2"/>
       </w:pPr>
       <w:r>
+        <w:t>Limite comercial/compliance</w:t>
+      </w:r>
+    </w:p>
+    <w:p/>
+    <w:p>
+      <w:r>
+        <w:t>O corretor deve usar este caso como orientação de atendimento, sem prometer aceitação, cobertura, valor de indenização, prazo, benefício fiscal, manutenção de contrato ou resultado de análise. A decisão final depende da apólice, declaração de saúde, documentos, situação familiar, regras fiscais quando aplicáveis e avaliação da seguradora ou órgão competente.</w:t>
+      </w:r>
+    </w:p>
+    <w:p/>
+    <w:p>
+      <w:pPr>
+        <w:pStyle w:val="Heading2"/>
+      </w:pPr>
+      <w:r>
         <w:t>Termos relacionados</w:t>
       </w:r>
     </w:p>
+    <w:p/>
     <w:p>
       <w:pPr>
         <w:pStyle w:val="ListBullet"/>
@@ -2131,6 +2493,7 @@
         <w:t>VIDA-0016 - 保険期間 - Período de cobertura</w:t>
       </w:r>
     </w:p>
+    <w:p/>
     <w:p>
       <w:pPr>
         <w:pStyle w:val="Heading2"/>
@@ -2139,6 +2502,7 @@
         <w:t>FAQs relacionadas</w:t>
       </w:r>
     </w:p>
+    <w:p/>
     <w:p>
       <w:pPr>
         <w:pStyle w:val="ListBullet"/>
@@ -2163,6 +2527,7 @@
         <w:t>FAQ-VIDA-0016</w:t>
       </w:r>
     </w:p>
+    <w:p/>
     <w:p>
       <w:pPr>
         <w:pStyle w:val="Heading2"/>
@@ -2171,6 +2536,7 @@
         <w:t>Diálogos relacionados</w:t>
       </w:r>
     </w:p>
+    <w:p/>
     <w:p>
       <w:pPr>
         <w:pStyle w:val="ListBullet"/>
@@ -2179,6 +2545,7 @@
         <w:t>DIALOGUE-VIDA-0004</w:t>
       </w:r>
     </w:p>
+    <w:p/>
     <w:p>
       <w:pPr>
         <w:pStyle w:val="Heading2"/>
@@ -2187,6 +2554,7 @@
         <w:t>Referências cruzadas</w:t>
       </w:r>
     </w:p>
+    <w:p/>
     <w:p>
       <w:pPr>
         <w:pStyle w:val="ListBullet"/>
@@ -2243,6 +2611,7 @@
         <w:t>DIALOGUE-VIDA-0004</w:t>
       </w:r>
     </w:p>
+    <w:p/>
     <w:p>
       <w:pPr>
         <w:pStyle w:val="Heading2"/>
@@ -2251,6 +2620,7 @@
         <w:t>Referências</w:t>
       </w:r>
     </w:p>
+    <w:p/>
     <w:p>
       <w:pPr>
         <w:pStyle w:val="ListBullet"/>
@@ -2259,6 +2629,7 @@
         <w:t>Documento interno: `EDITORIAL_RULES.md`</w:t>
       </w:r>
     </w:p>
+    <w:p/>
     <w:p>
       <w:pPr>
         <w:pStyle w:val="Heading2"/>
@@ -2267,6 +2638,7 @@
         <w:t>Tags</w:t>
       </w:r>
     </w:p>
+    <w:p/>
     <w:p>
       <w:pPr>
         <w:pStyle w:val="ListBullet"/>
@@ -2299,6 +2671,7 @@
         <w:t>atendimento</w:t>
       </w:r>
     </w:p>
+    <w:p/>
     <w:p>
       <w:pPr>
         <w:pStyle w:val="Heading2"/>
@@ -2307,6 +2680,7 @@
         <w:t>Veja também</w:t>
       </w:r>
     </w:p>
+    <w:p/>
     <w:p>
       <w:pPr>
         <w:pStyle w:val="ListBullet"/>
@@ -2315,6 +2689,7 @@
         <w:t>`14_FAQ/VIDA/FAQ-VIDA-0014.md`</w:t>
       </w:r>
     </w:p>
+    <w:p/>
     <w:p>
       <w:pPr>
         <w:pStyle w:val="Heading2"/>
@@ -2323,6 +2698,7 @@
         <w:t>Histórico de revisão</w:t>
       </w:r>
     </w:p>
+    <w:p/>
     <w:p>
       <w:r>
         <w:t>| Data | Versão | Autor | Alteração |</w:t>
@@ -2340,9 +2716,16 @@
     </w:p>
     <w:p>
       <w:r>
-        <w:t>————————————————————————</w:t>
-      </w:r>
-    </w:p>
+        <w:t>| 2026-06-26 | 0.2 | JP-BR Insurance Knowledge Base | Inclusão de limite comercial/compliance para uso seguro em atendimento e NotebookLM. |</w:t>
+      </w:r>
+    </w:p>
+    <w:p/>
+    <w:p>
+      <w:r>
+        <w:br w:type="page"/>
+      </w:r>
+    </w:p>
+    <w:p/>
     <w:p>
       <w:pPr>
         <w:pStyle w:val="Heading1"/>
@@ -2351,6 +2734,7 @@
         <w:t>CASE-VIDA-0007 - Cliente espera resgate integral ao cancelar</w:t>
       </w:r>
     </w:p>
+    <w:p/>
     <w:p>
       <w:pPr>
         <w:pStyle w:val="Heading2"/>
@@ -2359,12 +2743,13 @@
         <w:t>Controle</w:t>
       </w:r>
     </w:p>
+    <w:p/>
     <w:p>
       <w:pPr>
         <w:pStyle w:val="ListBullet"/>
       </w:pPr>
       <w:r>
-        <w:t>Versão: 0.1</w:t>
+        <w:t>Versão: 0.2</w:t>
       </w:r>
     </w:p>
     <w:p>
@@ -2388,9 +2773,10 @@
         <w:pStyle w:val="ListBullet"/>
       </w:pPr>
       <w:r>
-        <w:t>Histórico: Criação inicial.</w:t>
-      </w:r>
-    </w:p>
+        <w:t>Histórico: Criação inicial; inclusão de limite comercial/compliance.</w:t>
+      </w:r>
+    </w:p>
+    <w:p/>
     <w:p>
       <w:pPr>
         <w:pStyle w:val="Heading2"/>
@@ -2399,11 +2785,13 @@
         <w:t>Código</w:t>
       </w:r>
     </w:p>
+    <w:p/>
     <w:p>
       <w:r>
         <w:t>CASE-VIDA-0007</w:t>
       </w:r>
     </w:p>
+    <w:p/>
     <w:p>
       <w:pPr>
         <w:pStyle w:val="Heading2"/>
@@ -2412,11 +2800,13 @@
         <w:t>Produto ou categoria</w:t>
       </w:r>
     </w:p>
+    <w:p/>
     <w:p>
       <w:r>
         <w:t>VIDA</w:t>
       </w:r>
     </w:p>
+    <w:p/>
     <w:p>
       <w:pPr>
         <w:pStyle w:val="Heading2"/>
@@ -2425,11 +2815,13 @@
         <w:t>Situação</w:t>
       </w:r>
     </w:p>
+    <w:p/>
     <w:p>
       <w:r>
         <w:t>Cliente espera resgate integral ao cancelar.</w:t>
       </w:r>
     </w:p>
+    <w:p/>
     <w:p>
       <w:pPr>
         <w:pStyle w:val="Heading2"/>
@@ -2438,11 +2830,13 @@
         <w:t>Problema</w:t>
       </w:r>
     </w:p>
+    <w:p/>
     <w:p>
       <w:r>
         <w:t>Cliente pode escolher cobertura inadequada por não entender finalidade, papéis contratuais, períodos ou regras iniciais do seguro de vida.</w:t>
       </w:r>
     </w:p>
+    <w:p/>
     <w:p>
       <w:pPr>
         <w:pStyle w:val="Heading2"/>
@@ -2451,11 +2845,13 @@
         <w:t>Análise</w:t>
       </w:r>
     </w:p>
+    <w:p/>
     <w:p>
       <w:r>
         <w:t>Seguro de vida deve ser explicado a partir da finalidade de proteção, pessoas envolvidas, valor de cobertura, prêmio, período e condições de aceitação.</w:t>
       </w:r>
     </w:p>
+    <w:p/>
     <w:p>
       <w:pPr>
         <w:pStyle w:val="Heading2"/>
@@ -2464,11 +2860,13 @@
         <w:t>Orientação ao corretor</w:t>
       </w:r>
     </w:p>
+    <w:p/>
     <w:p>
       <w:r>
         <w:t>Confirmar objetivo do cliente, estrutura familiar, orçamento, necessidade de proteção e entendimento sobre declaração de saúde e início da cobertura.</w:t>
       </w:r>
     </w:p>
+    <w:p/>
     <w:p>
       <w:pPr>
         <w:pStyle w:val="Heading2"/>
@@ -2477,11 +2875,13 @@
         <w:t>Como explicar ao cliente brasileiro</w:t>
       </w:r>
     </w:p>
+    <w:p/>
     <w:p>
       <w:r>
         <w:t>Antes de escolher o seguro, precisamos entender quem será protegido, quem receberá o valor e quando a cobertura começa.</w:t>
       </w:r>
     </w:p>
+    <w:p/>
     <w:p>
       <w:pPr>
         <w:pStyle w:val="Heading2"/>
@@ -2490,19 +2890,37 @@
         <w:t>Resultado esperado</w:t>
       </w:r>
     </w:p>
+    <w:p/>
     <w:p>
       <w:r>
         <w:t>Cliente compreende os fundamentos e consegue comparar opções sem confundir tipos de cobertura.</w:t>
       </w:r>
     </w:p>
+    <w:p/>
     <w:p>
       <w:pPr>
         <w:pStyle w:val="Heading2"/>
       </w:pPr>
       <w:r>
+        <w:t>Limite comercial/compliance</w:t>
+      </w:r>
+    </w:p>
+    <w:p/>
+    <w:p>
+      <w:r>
+        <w:t>O corretor deve usar este caso como orientação de atendimento, sem prometer aceitação, cobertura, valor de indenização, prazo, benefício fiscal, manutenção de contrato ou resultado de análise. A decisão final depende da apólice, declaração de saúde, documentos, situação familiar, regras fiscais quando aplicáveis e avaliação da seguradora ou órgão competente.</w:t>
+      </w:r>
+    </w:p>
+    <w:p/>
+    <w:p>
+      <w:pPr>
+        <w:pStyle w:val="Heading2"/>
+      </w:pPr>
+      <w:r>
         <w:t>Termos relacionados</w:t>
       </w:r>
     </w:p>
+    <w:p/>
     <w:p>
       <w:pPr>
         <w:pStyle w:val="ListBullet"/>
@@ -2519,6 +2937,7 @@
         <w:t>VIDA-0014 - 保険料 - Prêmio do seguro de vida</w:t>
       </w:r>
     </w:p>
+    <w:p/>
     <w:p>
       <w:pPr>
         <w:pStyle w:val="Heading2"/>
@@ -2527,6 +2946,7 @@
         <w:t>FAQs relacionadas</w:t>
       </w:r>
     </w:p>
+    <w:p/>
     <w:p>
       <w:pPr>
         <w:pStyle w:val="ListBullet"/>
@@ -2543,6 +2963,7 @@
         <w:t>FAQ-VIDA-0014</w:t>
       </w:r>
     </w:p>
+    <w:p/>
     <w:p>
       <w:pPr>
         <w:pStyle w:val="Heading2"/>
@@ -2551,6 +2972,7 @@
         <w:t>Diálogos relacionados</w:t>
       </w:r>
     </w:p>
+    <w:p/>
     <w:p>
       <w:pPr>
         <w:pStyle w:val="ListBullet"/>
@@ -2559,6 +2981,7 @@
         <w:t>DIALOGUE-VIDA-0005</w:t>
       </w:r>
     </w:p>
+    <w:p/>
     <w:p>
       <w:pPr>
         <w:pStyle w:val="Heading2"/>
@@ -2567,6 +2990,7 @@
         <w:t>Referências cruzadas</w:t>
       </w:r>
     </w:p>
+    <w:p/>
     <w:p>
       <w:pPr>
         <w:pStyle w:val="ListBullet"/>
@@ -2607,6 +3031,7 @@
         <w:t>DIALOGUE-VIDA-0005</w:t>
       </w:r>
     </w:p>
+    <w:p/>
     <w:p>
       <w:pPr>
         <w:pStyle w:val="Heading2"/>
@@ -2615,6 +3040,7 @@
         <w:t>Referências</w:t>
       </w:r>
     </w:p>
+    <w:p/>
     <w:p>
       <w:pPr>
         <w:pStyle w:val="ListBullet"/>
@@ -2623,6 +3049,7 @@
         <w:t>Documento interno: `EDITORIAL_RULES.md`</w:t>
       </w:r>
     </w:p>
+    <w:p/>
     <w:p>
       <w:pPr>
         <w:pStyle w:val="Heading2"/>
@@ -2631,6 +3058,7 @@
         <w:t>Tags</w:t>
       </w:r>
     </w:p>
+    <w:p/>
     <w:p>
       <w:pPr>
         <w:pStyle w:val="ListBullet"/>
@@ -2663,6 +3091,7 @@
         <w:t>atendimento</w:t>
       </w:r>
     </w:p>
+    <w:p/>
     <w:p>
       <w:pPr>
         <w:pStyle w:val="Heading2"/>
@@ -2671,6 +3100,7 @@
         <w:t>Veja também</w:t>
       </w:r>
     </w:p>
+    <w:p/>
     <w:p>
       <w:pPr>
         <w:pStyle w:val="ListBullet"/>
@@ -2679,6 +3109,7 @@
         <w:t>`14_FAQ/VIDA/FAQ-VIDA-0017.md`</w:t>
       </w:r>
     </w:p>
+    <w:p/>
     <w:p>
       <w:pPr>
         <w:pStyle w:val="Heading2"/>
@@ -2687,6 +3118,7 @@
         <w:t>Histórico de revisão</w:t>
       </w:r>
     </w:p>
+    <w:p/>
     <w:p>
       <w:r>
         <w:t>| Data | Versão | Autor | Alteração |</w:t>
@@ -2704,9 +3136,16 @@
     </w:p>
     <w:p>
       <w:r>
-        <w:t>————————————————————————</w:t>
-      </w:r>
-    </w:p>
+        <w:t>| 2026-06-26 | 0.2 | JP-BR Insurance Knowledge Base | Inclusão de limite comercial/compliance para uso seguro em atendimento e NotebookLM. |</w:t>
+      </w:r>
+    </w:p>
+    <w:p/>
+    <w:p>
+      <w:r>
+        <w:br w:type="page"/>
+      </w:r>
+    </w:p>
+    <w:p/>
     <w:p>
       <w:pPr>
         <w:pStyle w:val="Heading1"/>
@@ -2715,6 +3154,7 @@
         <w:t>CASE-VIDA-0008 - Cliente precisa entender declaração de saúde, carência e início da cobertura</w:t>
       </w:r>
     </w:p>
+    <w:p/>
     <w:p>
       <w:pPr>
         <w:pStyle w:val="Heading2"/>
@@ -2723,12 +3163,13 @@
         <w:t>Controle</w:t>
       </w:r>
     </w:p>
+    <w:p/>
     <w:p>
       <w:pPr>
         <w:pStyle w:val="ListBullet"/>
       </w:pPr>
       <w:r>
-        <w:t>Versão: 0.1</w:t>
+        <w:t>Versão: 0.2</w:t>
       </w:r>
     </w:p>
     <w:p>
@@ -2752,9 +3193,10 @@
         <w:pStyle w:val="ListBullet"/>
       </w:pPr>
       <w:r>
-        <w:t>Histórico: Criação inicial.</w:t>
-      </w:r>
-    </w:p>
+        <w:t>Histórico: Criação inicial; inclusão de limite comercial/compliance.</w:t>
+      </w:r>
+    </w:p>
+    <w:p/>
     <w:p>
       <w:pPr>
         <w:pStyle w:val="Heading2"/>
@@ -2763,11 +3205,13 @@
         <w:t>Código</w:t>
       </w:r>
     </w:p>
+    <w:p/>
     <w:p>
       <w:r>
         <w:t>CASE-VIDA-0008</w:t>
       </w:r>
     </w:p>
+    <w:p/>
     <w:p>
       <w:pPr>
         <w:pStyle w:val="Heading2"/>
@@ -2776,11 +3220,13 @@
         <w:t>Produto ou categoria</w:t>
       </w:r>
     </w:p>
+    <w:p/>
     <w:p>
       <w:r>
         <w:t>VIDA</w:t>
       </w:r>
     </w:p>
+    <w:p/>
     <w:p>
       <w:pPr>
         <w:pStyle w:val="Heading2"/>
@@ -2789,11 +3235,13 @@
         <w:t>Situação</w:t>
       </w:r>
     </w:p>
+    <w:p/>
     <w:p>
       <w:r>
         <w:t>Cliente precisa entender declaração de saúde, carência e início da cobertura.</w:t>
       </w:r>
     </w:p>
+    <w:p/>
     <w:p>
       <w:pPr>
         <w:pStyle w:val="Heading2"/>
@@ -2802,11 +3250,13 @@
         <w:t>Problema</w:t>
       </w:r>
     </w:p>
+    <w:p/>
     <w:p>
       <w:r>
         <w:t>Cliente pode escolher cobertura inadequada por não entender finalidade, papéis contratuais, períodos ou regras iniciais do seguro de vida.</w:t>
       </w:r>
     </w:p>
+    <w:p/>
     <w:p>
       <w:pPr>
         <w:pStyle w:val="Heading2"/>
@@ -2815,11 +3265,13 @@
         <w:t>Análise</w:t>
       </w:r>
     </w:p>
+    <w:p/>
     <w:p>
       <w:r>
         <w:t>Seguro de vida deve ser explicado a partir da finalidade de proteção, pessoas envolvidas, valor de cobertura, prêmio, período e condições de aceitação.</w:t>
       </w:r>
     </w:p>
+    <w:p/>
     <w:p>
       <w:pPr>
         <w:pStyle w:val="Heading2"/>
@@ -2828,11 +3280,13 @@
         <w:t>Orientação ao corretor</w:t>
       </w:r>
     </w:p>
+    <w:p/>
     <w:p>
       <w:r>
         <w:t>Confirmar objetivo do cliente, estrutura familiar, orçamento, necessidade de proteção e entendimento sobre declaração de saúde e início da cobertura.</w:t>
       </w:r>
     </w:p>
+    <w:p/>
     <w:p>
       <w:pPr>
         <w:pStyle w:val="Heading2"/>
@@ -2841,11 +3295,13 @@
         <w:t>Como explicar ao cliente brasileiro</w:t>
       </w:r>
     </w:p>
+    <w:p/>
     <w:p>
       <w:r>
         <w:t>Antes de escolher o seguro, precisamos entender quem será protegido, quem receberá o valor e quando a cobertura começa.</w:t>
       </w:r>
     </w:p>
+    <w:p/>
     <w:p>
       <w:pPr>
         <w:pStyle w:val="Heading2"/>
@@ -2854,19 +3310,37 @@
         <w:t>Resultado esperado</w:t>
       </w:r>
     </w:p>
+    <w:p/>
     <w:p>
       <w:r>
         <w:t>Cliente compreende os fundamentos e consegue comparar opções sem confundir tipos de cobertura.</w:t>
       </w:r>
     </w:p>
+    <w:p/>
     <w:p>
       <w:pPr>
         <w:pStyle w:val="Heading2"/>
       </w:pPr>
       <w:r>
+        <w:t>Limite comercial/compliance</w:t>
+      </w:r>
+    </w:p>
+    <w:p/>
+    <w:p>
+      <w:r>
+        <w:t>O corretor deve usar este caso como orientação de atendimento, sem prometer aceitação, cobertura, valor de indenização, prazo, benefício fiscal, manutenção de contrato ou resultado de análise. A decisão final depende da apólice, declaração de saúde, documentos, situação familiar, regras fiscais quando aplicáveis e avaliação da seguradora ou órgão competente.</w:t>
+      </w:r>
+    </w:p>
+    <w:p/>
+    <w:p>
+      <w:pPr>
+        <w:pStyle w:val="Heading2"/>
+      </w:pPr>
+      <w:r>
         <w:t>Termos relacionados</w:t>
       </w:r>
     </w:p>
+    <w:p/>
     <w:p>
       <w:pPr>
         <w:pStyle w:val="ListBullet"/>
@@ -2891,6 +3365,7 @@
         <w:t>VIDA-0020 - 責任開始日 - Data de início da responsabilidade da seguradora</w:t>
       </w:r>
     </w:p>
+    <w:p/>
     <w:p>
       <w:pPr>
         <w:pStyle w:val="Heading2"/>
@@ -2899,6 +3374,7 @@
         <w:t>FAQs relacionadas</w:t>
       </w:r>
     </w:p>
+    <w:p/>
     <w:p>
       <w:pPr>
         <w:pStyle w:val="ListBullet"/>
@@ -2923,6 +3399,7 @@
         <w:t>FAQ-VIDA-0020</w:t>
       </w:r>
     </w:p>
+    <w:p/>
     <w:p>
       <w:pPr>
         <w:pStyle w:val="Heading2"/>
@@ -2931,6 +3408,7 @@
         <w:t>Diálogos relacionados</w:t>
       </w:r>
     </w:p>
+    <w:p/>
     <w:p>
       <w:pPr>
         <w:pStyle w:val="ListBullet"/>
@@ -2939,6 +3417,7 @@
         <w:t>DIALOGUE-VIDA-0005</w:t>
       </w:r>
     </w:p>
+    <w:p/>
     <w:p>
       <w:pPr>
         <w:pStyle w:val="Heading2"/>
@@ -2947,6 +3426,7 @@
         <w:t>Referências cruzadas</w:t>
       </w:r>
     </w:p>
+    <w:p/>
     <w:p>
       <w:pPr>
         <w:pStyle w:val="ListBullet"/>
@@ -3003,6 +3483,7 @@
         <w:t>DIALOGUE-VIDA-0005</w:t>
       </w:r>
     </w:p>
+    <w:p/>
     <w:p>
       <w:pPr>
         <w:pStyle w:val="Heading2"/>
@@ -3011,6 +3492,7 @@
         <w:t>Referências</w:t>
       </w:r>
     </w:p>
+    <w:p/>
     <w:p>
       <w:pPr>
         <w:pStyle w:val="ListBullet"/>
@@ -3019,6 +3501,7 @@
         <w:t>Documento interno: `EDITORIAL_RULES.md`</w:t>
       </w:r>
     </w:p>
+    <w:p/>
     <w:p>
       <w:pPr>
         <w:pStyle w:val="Heading2"/>
@@ -3027,6 +3510,7 @@
         <w:t>Tags</w:t>
       </w:r>
     </w:p>
+    <w:p/>
     <w:p>
       <w:pPr>
         <w:pStyle w:val="ListBullet"/>
@@ -3059,6 +3543,7 @@
         <w:t>atendimento</w:t>
       </w:r>
     </w:p>
+    <w:p/>
     <w:p>
       <w:pPr>
         <w:pStyle w:val="Heading2"/>
@@ -3067,6 +3552,7 @@
         <w:t>Veja também</w:t>
       </w:r>
     </w:p>
+    <w:p/>
     <w:p>
       <w:pPr>
         <w:pStyle w:val="ListBullet"/>
@@ -3075,6 +3561,7 @@
         <w:t>`14_FAQ/VIDA/FAQ-VIDA-0018.md`</w:t>
       </w:r>
     </w:p>
+    <w:p/>
     <w:p>
       <w:pPr>
         <w:pStyle w:val="Heading2"/>
@@ -3083,6 +3570,7 @@
         <w:t>Histórico de revisão</w:t>
       </w:r>
     </w:p>
+    <w:p/>
     <w:p>
       <w:r>
         <w:t>| Data | Versão | Autor | Alteração |</w:t>
@@ -3096,6 +3584,36 @@
     <w:p>
       <w:r>
         <w:t>| 2026-06-25 | 0.1 | JP-BR Insurance Knowledge Base | Criação inicial. |</w:t>
+      </w:r>
+    </w:p>
+    <w:p>
+      <w:r>
+        <w:t>| 2026-06-26 | 0.2 | JP-BR Insurance Knowledge Base | Inclusão de limite comercial/compliance para uso seguro em atendimento e NotebookLM. |</w:t>
+      </w:r>
+    </w:p>
+    <w:p/>
+    <w:p>
+      <w:pPr>
+        <w:pStyle w:val="Heading2"/>
+      </w:pPr>
+      <w:r>
+        <w:t>Histórico de revisão</w:t>
+      </w:r>
+    </w:p>
+    <w:p/>
+    <w:p>
+      <w:r>
+        <w:t>| Data | Versão | Autor | Alteração |</w:t>
+      </w:r>
+    </w:p>
+    <w:p>
+      <w:r>
+        <w:t>| --- | --- | --- | --- |</w:t>
+      </w:r>
+    </w:p>
+    <w:p>
+      <w:r>
+        <w:t>| 2026-06-26 | 0.2 | JP-BR Insurance Knowledge Base | Regeneração do pacote com normalização de compliance dos estudos de caso VIDA. |</w:t>
       </w:r>
     </w:p>
     <w:sectPr>
@@ -3472,7 +3990,7 @@
     <w:qFormat/>
     <w:rsid w:val="00FC693F"/>
     <w:rPr>
-      <w:rFonts w:ascii="Arial Unicode MS" w:hAnsi="Arial Unicode MS"/>
+      <w:rFonts w:ascii="Arial" w:hAnsi="Arial"/>
       <w:sz w:val="20"/>
     </w:rPr>
   </w:style>

</xml_diff>